<commit_message>
update resume, add Stepik cert
</commit_message>
<xml_diff>
--- a/Documents/dmitrii_konstantinov_cv.docx
+++ b/Documents/dmitrii_konstantinov_cv.docx
@@ -899,8 +899,6 @@
         </w:rPr>
         <w:t xml:space="preserve"> </w:t>
       </w:r>
-      <w:bookmarkStart w:id="0" w:name="_GoBack"/>
-      <w:bookmarkEnd w:id="0"/>
     </w:p>
     <w:p>
       <w:pPr>
@@ -2595,7 +2593,7 @@
           </w:tcPr>
           <w:tbl>
             <w:tblPr>
-              <w:tblW w:w="10207" w:type="dxa"/>
+              <w:tblW w:w="10201" w:type="dxa"/>
               <w:jc w:val="center"/>
               <w:tblBorders>
                 <w:top w:val="single" w:sz="4" w:space="0" w:color="BDD6EE"/>
@@ -2615,17 +2613,17 @@
               <w:tblLook w:val="04A0" w:firstRow="1" w:lastRow="0" w:firstColumn="1" w:lastColumn="0" w:noHBand="0" w:noVBand="1"/>
             </w:tblPr>
             <w:tblGrid>
-              <w:gridCol w:w="2958"/>
+              <w:gridCol w:w="2952"/>
               <w:gridCol w:w="7249"/>
             </w:tblGrid>
             <w:tr>
               <w:trPr>
-                <w:trHeight w:val="284"/>
+                <w:trHeight w:val="285"/>
                 <w:jc w:val="center"/>
               </w:trPr>
               <w:tc>
                 <w:tcPr>
-                  <w:tcW w:w="2958" w:type="dxa"/>
+                  <w:tcW w:w="2952" w:type="dxa"/>
                   <w:vAlign w:val="center"/>
                 </w:tcPr>
                 <w:p>
@@ -2639,6 +2637,98 @@
                       <w:sz w:val="18"/>
                       <w:szCs w:val="18"/>
                       <w:lang w:eastAsia="ru-RU"/>
+                    </w:rPr>
+                  </w:pPr>
+                  <w:r>
+                    <w:rPr>
+                      <w:rFonts w:ascii="Tahoma" w:hAnsi="Tahoma" w:cs="Tahoma"/>
+                      <w:b/>
+                      <w:bCs/>
+                      <w:color w:val="595959"/>
+                      <w:sz w:val="18"/>
+                      <w:szCs w:val="18"/>
+                      <w:lang w:val="ru-RU" w:eastAsia="ru-RU"/>
+                    </w:rPr>
+                    <w:t>Выдано</w:t>
+                  </w:r>
+                  <w:r>
+                    <w:rPr>
+                      <w:rFonts w:ascii="Tahoma" w:hAnsi="Tahoma" w:cs="Tahoma"/>
+                      <w:b/>
+                      <w:bCs/>
+                      <w:color w:val="595959"/>
+                      <w:sz w:val="18"/>
+                      <w:szCs w:val="18"/>
+                      <w:lang w:val="ru-RU" w:eastAsia="ru-RU"/>
+                    </w:rPr>
+                    <w:t>:</w:t>
+                  </w:r>
+                </w:p>
+              </w:tc>
+              <w:tc>
+                <w:tcPr>
+                  <w:tcW w:w="7249" w:type="dxa"/>
+                  <w:vAlign w:val="center"/>
+                </w:tcPr>
+                <w:p>
+                  <w:pPr>
+                    <w:pStyle w:val="Description"/>
+                    <w:spacing w:before="0" w:after="0"/>
+                    <w:jc w:val="left"/>
+                    <w:rPr>
+                      <w:rFonts w:ascii="Tahoma" w:hAnsi="Tahoma" w:cs="Tahoma"/>
+                      <w:color w:val="595959"/>
+                      <w:sz w:val="20"/>
+                      <w:lang w:val="ru-RU" w:eastAsia="ru-RU"/>
+                    </w:rPr>
+                  </w:pPr>
+                  <w:proofErr w:type="spellStart"/>
+                  <w:r>
+                    <w:rPr>
+                      <w:rFonts w:ascii="Tahoma" w:hAnsi="Tahoma" w:cs="Tahoma"/>
+                      <w:color w:val="595959"/>
+                      <w:sz w:val="20"/>
+                      <w:lang w:val="en-US" w:eastAsia="ru-RU"/>
+                    </w:rPr>
+                    <w:t>GeekBrains</w:t>
+                  </w:r>
+                  <w:proofErr w:type="spellEnd"/>
+                  <w:r>
+                    <w:rPr>
+                      <w:rFonts w:ascii="Tahoma" w:hAnsi="Tahoma" w:cs="Tahoma"/>
+                      <w:color w:val="595959"/>
+                      <w:sz w:val="20"/>
+                      <w:lang w:val="en-US" w:eastAsia="ru-RU"/>
+                    </w:rPr>
+                    <w:t xml:space="preserve"> @mail.ru group</w:t>
+                  </w:r>
+                </w:p>
+              </w:tc>
+            </w:tr>
+            <w:tr>
+              <w:trPr>
+                <w:trHeight w:val="285"/>
+                <w:jc w:val="center"/>
+              </w:trPr>
+              <w:tc>
+                <w:tcPr>
+                  <w:tcW w:w="2952" w:type="dxa"/>
+                  <w:vAlign w:val="center"/>
+                </w:tcPr>
+                <w:p>
+                  <w:pPr>
+                    <w:pStyle w:val="Description"/>
+                    <w:spacing w:before="0" w:after="0"/>
+                    <w:ind w:left="6"/>
+                    <w:jc w:val="left"/>
+                    <w:rPr>
+                      <w:rFonts w:ascii="Tahoma" w:hAnsi="Tahoma" w:cs="Tahoma"/>
+                      <w:b/>
+                      <w:bCs/>
+                      <w:color w:val="595959"/>
+                      <w:sz w:val="18"/>
+                      <w:szCs w:val="18"/>
+                      <w:lang w:val="ru-RU" w:eastAsia="ru-RU"/>
                     </w:rPr>
                   </w:pPr>
                   <w:r>
@@ -2669,7 +2759,7 @@
               </w:tc>
               <w:tc>
                 <w:tcPr>
-                  <w:tcW w:w="7248" w:type="dxa"/>
+                  <w:tcW w:w="7249" w:type="dxa"/>
                   <w:vAlign w:val="center"/>
                 </w:tcPr>
                 <w:p>
@@ -2692,7 +2782,16 @@
                       <w:sz w:val="20"/>
                       <w:lang w:val="ru-RU"/>
                     </w:rPr>
-                    <w:t xml:space="preserve">Основы ООП, </w:t>
+                    <w:t>Основы ООП (</w:t>
+                  </w:r>
+                  <w:r>
+                    <w:rPr>
+                      <w:rFonts w:ascii="Tahoma" w:hAnsi="Tahoma" w:cs="Tahoma"/>
+                      <w:color w:val="595959"/>
+                      <w:sz w:val="20"/>
+                      <w:lang w:val="ru-RU" w:eastAsia="ru-RU"/>
+                    </w:rPr>
+                    <w:t>0729552)</w:t>
                   </w:r>
                   <w:r>
                     <w:rPr>
@@ -2702,7 +2801,7 @@
                       <w:sz w:val="20"/>
                       <w:lang w:val="ru-RU"/>
                     </w:rPr>
-                    <w:t xml:space="preserve">Основы языка </w:t>
+                    <w:t xml:space="preserve">, Основы языка </w:t>
                   </w:r>
                   <w:r>
                     <w:rPr>
@@ -2722,6 +2821,25 @@
                       <w:sz w:val="20"/>
                       <w:lang w:val="ru-RU"/>
                     </w:rPr>
+                    <w:t xml:space="preserve"> (</w:t>
+                  </w:r>
+                  <w:r>
+                    <w:rPr>
+                      <w:rFonts w:ascii="Tahoma" w:hAnsi="Tahoma" w:cs="Tahoma"/>
+                      <w:color w:val="595959"/>
+                      <w:sz w:val="20"/>
+                      <w:lang w:val="ru-RU" w:eastAsia="ru-RU"/>
+                    </w:rPr>
+                    <w:t>0441358)</w:t>
+                  </w:r>
+                  <w:r>
+                    <w:rPr>
+                      <w:rStyle w:val="hps"/>
+                      <w:rFonts w:ascii="Tahoma" w:hAnsi="Tahoma" w:cs="Tahoma"/>
+                      <w:color w:val="595959"/>
+                      <w:sz w:val="20"/>
+                      <w:lang w:val="ru-RU"/>
+                    </w:rPr>
                     <w:t>,</w:t>
                   </w:r>
                   <w:r>
@@ -2732,7 +2850,16 @@
                       <w:sz w:val="20"/>
                       <w:lang w:val="ru-RU"/>
                     </w:rPr>
-                    <w:t xml:space="preserve"> Гит, </w:t>
+                    <w:t xml:space="preserve"> Гит (</w:t>
+                  </w:r>
+                  <w:r>
+                    <w:rPr>
+                      <w:rFonts w:ascii="Tahoma" w:hAnsi="Tahoma" w:cs="Tahoma"/>
+                      <w:color w:val="595959"/>
+                      <w:sz w:val="20"/>
+                      <w:lang w:val="ru-RU" w:eastAsia="ru-RU"/>
+                    </w:rPr>
+                    <w:t>0721678)</w:t>
                   </w:r>
                   <w:r>
                     <w:rPr>
@@ -2742,7 +2869,7 @@
                       <w:sz w:val="20"/>
                       <w:lang w:val="ru-RU"/>
                     </w:rPr>
-                    <w:t xml:space="preserve">Пользовательский интерфейс </w:t>
+                    <w:t xml:space="preserve">, Пользовательский интерфейс </w:t>
                   </w:r>
                   <w:r>
                     <w:rPr>
@@ -2762,7 +2889,16 @@
                       <w:sz w:val="20"/>
                       <w:lang w:val="ru-RU"/>
                     </w:rPr>
-                    <w:t xml:space="preserve">-приложений, </w:t>
+                    <w:t>-приложений (</w:t>
+                  </w:r>
+                  <w:r>
+                    <w:rPr>
+                      <w:rFonts w:ascii="Tahoma" w:hAnsi="Tahoma" w:cs="Tahoma"/>
+                      <w:color w:val="595959"/>
+                      <w:sz w:val="20"/>
+                      <w:lang w:val="ru-RU" w:eastAsia="ru-RU"/>
+                    </w:rPr>
+                    <w:t>0703649)</w:t>
                   </w:r>
                   <w:r>
                     <w:rPr>
@@ -2772,7 +2908,26 @@
                       <w:sz w:val="20"/>
                       <w:lang w:val="ru-RU"/>
                     </w:rPr>
-                    <w:t>Алгоритмы и структуры данных,</w:t>
+                    <w:t>, Алгоритмы и структуры данных (</w:t>
+                  </w:r>
+                  <w:r>
+                    <w:rPr>
+                      <w:rFonts w:ascii="Tahoma" w:hAnsi="Tahoma" w:cs="Tahoma"/>
+                      <w:color w:val="595959"/>
+                      <w:sz w:val="20"/>
+                      <w:lang w:val="ru-RU" w:eastAsia="ru-RU"/>
+                    </w:rPr>
+                    <w:t>0720836)</w:t>
+                  </w:r>
+                  <w:r>
+                    <w:rPr>
+                      <w:rStyle w:val="hps"/>
+                      <w:rFonts w:ascii="Tahoma" w:hAnsi="Tahoma" w:cs="Tahoma"/>
+                      <w:color w:val="595959"/>
+                      <w:sz w:val="20"/>
+                      <w:lang w:val="ru-RU"/>
+                    </w:rPr>
+                    <w:t>,</w:t>
                   </w:r>
                   <w:r>
                     <w:rPr>
@@ -2792,17 +2947,7 @@
                       <w:sz w:val="20"/>
                       <w:lang w:val="ru-RU"/>
                     </w:rPr>
-                    <w:t xml:space="preserve">Основы баз данных, </w:t>
-                  </w:r>
-                  <w:r>
-                    <w:rPr>
-                      <w:rStyle w:val="hps"/>
-                      <w:rFonts w:ascii="Tahoma" w:hAnsi="Tahoma" w:cs="Tahoma"/>
-                      <w:color w:val="595959"/>
-                      <w:sz w:val="20"/>
-                      <w:lang w:val="ru-RU"/>
-                    </w:rPr>
-                    <w:t xml:space="preserve">Клиент-серверные </w:t>
+                    <w:t xml:space="preserve">Основы баз данных, Клиент-серверные </w:t>
                   </w:r>
                   <w:r>
                     <w:rPr>
@@ -2832,7 +2977,16 @@
                       <w:sz w:val="20"/>
                       <w:lang w:val="ru-RU"/>
                     </w:rPr>
-                    <w:t xml:space="preserve">приложения, </w:t>
+                    <w:t>приложения (</w:t>
+                  </w:r>
+                  <w:r>
+                    <w:rPr>
+                      <w:rFonts w:ascii="Tahoma" w:hAnsi="Tahoma" w:cs="Tahoma"/>
+                      <w:color w:val="595959"/>
+                      <w:sz w:val="20"/>
+                      <w:lang w:val="ru-RU" w:eastAsia="ru-RU"/>
+                    </w:rPr>
+                    <w:t>0721985)</w:t>
                   </w:r>
                   <w:r>
                     <w:rPr>
@@ -2842,7 +2996,7 @@
                       <w:sz w:val="20"/>
                       <w:lang w:val="ru-RU"/>
                     </w:rPr>
-                    <w:t xml:space="preserve">Английский для </w:t>
+                    <w:t xml:space="preserve">, Английский для </w:t>
                   </w:r>
                   <w:r>
                     <w:rPr>
@@ -2879,12 +3033,12 @@
             </w:tr>
             <w:tr>
               <w:trPr>
-                <w:trHeight w:val="284"/>
+                <w:trHeight w:val="285"/>
                 <w:jc w:val="center"/>
               </w:trPr>
               <w:tc>
                 <w:tcPr>
-                  <w:tcW w:w="2958" w:type="dxa"/>
+                  <w:tcW w:w="2952" w:type="dxa"/>
                   <w:vAlign w:val="center"/>
                 </w:tcPr>
                 <w:p>
@@ -2901,95 +3055,6 @@
                       <w:sz w:val="18"/>
                       <w:szCs w:val="18"/>
                       <w:lang w:val="ru-RU" w:eastAsia="ru-RU"/>
-                    </w:rPr>
-                  </w:pPr>
-                  <w:r>
-                    <w:rPr>
-                      <w:rFonts w:ascii="Tahoma" w:hAnsi="Tahoma" w:cs="Tahoma"/>
-                      <w:b/>
-                      <w:bCs/>
-                      <w:color w:val="595959"/>
-                      <w:sz w:val="18"/>
-                      <w:szCs w:val="18"/>
-                      <w:lang w:val="ru-RU" w:eastAsia="ru-RU"/>
-                    </w:rPr>
-                    <w:t>Выдано</w:t>
-                  </w:r>
-                  <w:r>
-                    <w:rPr>
-                      <w:rFonts w:ascii="Tahoma" w:hAnsi="Tahoma" w:cs="Tahoma"/>
-                      <w:b/>
-                      <w:bCs/>
-                      <w:color w:val="595959"/>
-                      <w:sz w:val="18"/>
-                      <w:szCs w:val="18"/>
-                      <w:lang w:val="ru-RU" w:eastAsia="ru-RU"/>
-                    </w:rPr>
-                    <w:t>:</w:t>
-                  </w:r>
-                </w:p>
-              </w:tc>
-              <w:tc>
-                <w:tcPr>
-                  <w:tcW w:w="7248" w:type="dxa"/>
-                  <w:vAlign w:val="center"/>
-                </w:tcPr>
-                <w:p>
-                  <w:pPr>
-                    <w:pStyle w:val="Description"/>
-                    <w:spacing w:before="0" w:after="0"/>
-                    <w:jc w:val="left"/>
-                    <w:rPr>
-                      <w:rFonts w:ascii="Tahoma" w:hAnsi="Tahoma" w:cs="Tahoma"/>
-                      <w:color w:val="595959"/>
-                      <w:sz w:val="20"/>
-                      <w:lang w:val="en-US" w:eastAsia="ru-RU"/>
-                    </w:rPr>
-                  </w:pPr>
-                  <w:proofErr w:type="spellStart"/>
-                  <w:r>
-                    <w:rPr>
-                      <w:rFonts w:ascii="Tahoma" w:hAnsi="Tahoma" w:cs="Tahoma"/>
-                      <w:color w:val="595959"/>
-                      <w:sz w:val="20"/>
-                      <w:lang w:val="en-US" w:eastAsia="ru-RU"/>
-                    </w:rPr>
-                    <w:t>GeekBrains</w:t>
-                  </w:r>
-                  <w:proofErr w:type="spellEnd"/>
-                  <w:r>
-                    <w:rPr>
-                      <w:rFonts w:ascii="Tahoma" w:hAnsi="Tahoma" w:cs="Tahoma"/>
-                      <w:color w:val="595959"/>
-                      <w:sz w:val="20"/>
-                      <w:lang w:val="en-US" w:eastAsia="ru-RU"/>
-                    </w:rPr>
-                    <w:t xml:space="preserve"> @mail.ru group</w:t>
-                  </w:r>
-                </w:p>
-              </w:tc>
-            </w:tr>
-            <w:tr>
-              <w:trPr>
-                <w:trHeight w:val="284"/>
-                <w:jc w:val="center"/>
-              </w:trPr>
-              <w:tc>
-                <w:tcPr>
-                  <w:tcW w:w="2958" w:type="dxa"/>
-                  <w:vAlign w:val="center"/>
-                </w:tcPr>
-                <w:p>
-                  <w:pPr>
-                    <w:pStyle w:val="Description"/>
-                    <w:spacing w:before="0" w:after="0"/>
-                    <w:jc w:val="left"/>
-                    <w:rPr>
-                      <w:rFonts w:ascii="Tahoma" w:hAnsi="Tahoma" w:cs="Tahoma"/>
-                      <w:color w:val="595959"/>
-                      <w:sz w:val="18"/>
-                      <w:szCs w:val="18"/>
-                      <w:lang w:eastAsia="ru-RU"/>
                     </w:rPr>
                   </w:pPr>
                   <w:r>
@@ -3020,7 +3085,7 @@
               </w:tc>
               <w:tc>
                 <w:tcPr>
-                  <w:tcW w:w="7248" w:type="dxa"/>
+                  <w:tcW w:w="7249" w:type="dxa"/>
                   <w:vAlign w:val="center"/>
                 </w:tcPr>
                 <w:p>
@@ -3042,16 +3107,7 @@
                       <w:sz w:val="20"/>
                       <w:lang w:val="ru-RU" w:eastAsia="ru-RU"/>
                     </w:rPr>
-                    <w:t>0</w:t>
-                  </w:r>
-                  <w:r>
-                    <w:rPr>
-                      <w:rFonts w:ascii="Tahoma" w:hAnsi="Tahoma" w:cs="Tahoma"/>
-                      <w:color w:val="595959"/>
-                      <w:sz w:val="20"/>
-                      <w:lang w:val="ru-RU" w:eastAsia="ru-RU"/>
-                    </w:rPr>
-                    <w:t>2</w:t>
+                    <w:t>02</w:t>
                   </w:r>
                   <w:r>
                     <w:rPr>
@@ -3139,12 +3195,12 @@
             </w:tr>
             <w:tr>
               <w:trPr>
-                <w:trHeight w:val="284"/>
+                <w:trHeight w:val="285"/>
                 <w:jc w:val="center"/>
               </w:trPr>
               <w:tc>
                 <w:tcPr>
-                  <w:tcW w:w="2958" w:type="dxa"/>
+                  <w:tcW w:w="2952" w:type="dxa"/>
                   <w:vAlign w:val="center"/>
                 </w:tcPr>
                 <w:p>
@@ -3173,8 +3229,93 @@
                       <w:szCs w:val="18"/>
                       <w:lang w:val="ru-RU" w:eastAsia="ru-RU"/>
                     </w:rPr>
-                    <w:t>Номера сертификатов</w:t>
+                    <w:t>Выдано</w:t>
                   </w:r>
+                  <w:r>
+                    <w:rPr>
+                      <w:rFonts w:ascii="Tahoma" w:hAnsi="Tahoma" w:cs="Tahoma"/>
+                      <w:b/>
+                      <w:bCs/>
+                      <w:color w:val="595959"/>
+                      <w:sz w:val="18"/>
+                      <w:szCs w:val="18"/>
+                      <w:lang w:eastAsia="ru-RU"/>
+                    </w:rPr>
+                    <w:t>:</w:t>
+                  </w:r>
+                </w:p>
+              </w:tc>
+              <w:tc>
+                <w:tcPr>
+                  <w:tcW w:w="7249" w:type="dxa"/>
+                  <w:vAlign w:val="center"/>
+                </w:tcPr>
+                <w:p>
+                  <w:pPr>
+                    <w:autoSpaceDE/>
+                    <w:autoSpaceDN/>
+                    <w:jc w:val="left"/>
+                    <w:rPr>
+                      <w:rFonts w:ascii="Tahoma" w:hAnsi="Tahoma" w:cs="Tahoma"/>
+                      <w:sz w:val="20"/>
+                      <w:lang w:val="ru-RU"/>
+                    </w:rPr>
+                  </w:pPr>
+                  <w:proofErr w:type="spellStart"/>
+                  <w:r>
+                    <w:rPr>
+                      <w:rFonts w:ascii="Tahoma" w:hAnsi="Tahoma" w:cs="Tahoma"/>
+                      <w:color w:val="595959"/>
+                      <w:sz w:val="20"/>
+                      <w:lang w:val="en-US"/>
+                    </w:rPr>
+                    <w:t>Stepik</w:t>
+                  </w:r>
+                  <w:proofErr w:type="spellEnd"/>
+                  <w:r>
+                    <w:rPr>
+                      <w:rFonts w:ascii="Tahoma" w:hAnsi="Tahoma" w:cs="Tahoma"/>
+                      <w:color w:val="595959"/>
+                      <w:sz w:val="20"/>
+                      <w:lang w:val="en-US"/>
+                    </w:rPr>
+                    <w:t xml:space="preserve"> education</w:t>
+                  </w:r>
+                  <w:r>
+                    <w:rPr>
+                      <w:rFonts w:ascii="Tahoma" w:hAnsi="Tahoma" w:cs="Tahoma"/>
+                      <w:color w:val="595959"/>
+                      <w:sz w:val="20"/>
+                      <w:lang w:val="ru-RU"/>
+                    </w:rPr>
+                    <w:t xml:space="preserve"> </w:t>
+                  </w:r>
+                </w:p>
+              </w:tc>
+            </w:tr>
+            <w:tr>
+              <w:trPr>
+                <w:trHeight w:val="285"/>
+                <w:jc w:val="center"/>
+              </w:trPr>
+              <w:tc>
+                <w:tcPr>
+                  <w:tcW w:w="2952" w:type="dxa"/>
+                  <w:vAlign w:val="center"/>
+                </w:tcPr>
+                <w:p>
+                  <w:pPr>
+                    <w:pStyle w:val="Description"/>
+                    <w:spacing w:before="0" w:after="0"/>
+                    <w:jc w:val="left"/>
+                    <w:rPr>
+                      <w:rFonts w:ascii="Tahoma" w:hAnsi="Tahoma" w:cs="Tahoma"/>
+                      <w:color w:val="595959"/>
+                      <w:sz w:val="18"/>
+                      <w:szCs w:val="18"/>
+                      <w:lang w:eastAsia="ru-RU"/>
+                    </w:rPr>
+                  </w:pPr>
                   <w:r>
                     <w:rPr>
                       <w:rFonts w:ascii="Tahoma" w:hAnsi="Tahoma" w:cs="Tahoma"/>
@@ -3185,13 +3326,132 @@
                       <w:szCs w:val="18"/>
                       <w:lang w:val="ru-RU" w:eastAsia="ru-RU"/>
                     </w:rPr>
+                    <w:t>Название курсов</w:t>
+                  </w:r>
+                  <w:r>
+                    <w:rPr>
+                      <w:rFonts w:ascii="Tahoma" w:hAnsi="Tahoma" w:cs="Tahoma"/>
+                      <w:b/>
+                      <w:bCs/>
+                      <w:color w:val="595959"/>
+                      <w:sz w:val="18"/>
+                      <w:szCs w:val="18"/>
+                      <w:lang w:eastAsia="ru-RU"/>
+                    </w:rPr>
                     <w:t>:</w:t>
                   </w:r>
                 </w:p>
               </w:tc>
               <w:tc>
                 <w:tcPr>
-                  <w:tcW w:w="7248" w:type="dxa"/>
+                  <w:tcW w:w="7249" w:type="dxa"/>
+                  <w:vAlign w:val="center"/>
+                </w:tcPr>
+                <w:p>
+                  <w:pPr>
+                    <w:pStyle w:val="Description"/>
+                    <w:spacing w:before="0" w:after="0"/>
+                    <w:jc w:val="left"/>
+                    <w:rPr>
+                      <w:rFonts w:ascii="Tahoma" w:hAnsi="Tahoma" w:cs="Tahoma"/>
+                      <w:color w:val="595959"/>
+                      <w:sz w:val="20"/>
+                      <w:lang w:val="ru-RU" w:eastAsia="ru-RU"/>
+                    </w:rPr>
+                  </w:pPr>
+                  <w:proofErr w:type="spellStart"/>
+                  <w:r>
+                    <w:rPr>
+                      <w:rFonts w:ascii="Tahoma" w:hAnsi="Tahoma" w:cs="Tahoma"/>
+                      <w:color w:val="595959"/>
+                      <w:sz w:val="20"/>
+                      <w:lang w:val="ru-RU" w:eastAsia="ru-RU"/>
+                    </w:rPr>
+                    <w:t>Многопоточность</w:t>
+                  </w:r>
+                  <w:proofErr w:type="spellEnd"/>
+                  <w:r>
+                    <w:rPr>
+                      <w:rFonts w:ascii="Tahoma" w:hAnsi="Tahoma" w:cs="Tahoma"/>
+                      <w:color w:val="595959"/>
+                      <w:sz w:val="20"/>
+                      <w:lang w:val="ru-RU" w:eastAsia="ru-RU"/>
+                    </w:rPr>
+                    <w:t xml:space="preserve"> в </w:t>
+                  </w:r>
+                  <w:r>
+                    <w:rPr>
+                      <w:rFonts w:ascii="Tahoma" w:hAnsi="Tahoma" w:cs="Tahoma"/>
+                      <w:color w:val="595959"/>
+                      <w:sz w:val="20"/>
+                      <w:lang w:val="en-US" w:eastAsia="ru-RU"/>
+                    </w:rPr>
+                    <w:t>iOS (Swift) (299210)</w:t>
+                  </w:r>
+                  <w:r>
+                    <w:rPr>
+                      <w:rFonts w:ascii="Tahoma" w:hAnsi="Tahoma" w:cs="Tahoma"/>
+                      <w:color w:val="595959"/>
+                      <w:sz w:val="20"/>
+                      <w:lang w:val="ru-RU" w:eastAsia="ru-RU"/>
+                    </w:rPr>
+                    <w:t xml:space="preserve"> </w:t>
+                  </w:r>
+                </w:p>
+              </w:tc>
+            </w:tr>
+            <w:tr>
+              <w:trPr>
+                <w:trHeight w:val="285"/>
+                <w:jc w:val="center"/>
+              </w:trPr>
+              <w:tc>
+                <w:tcPr>
+                  <w:tcW w:w="2952" w:type="dxa"/>
+                  <w:vAlign w:val="center"/>
+                </w:tcPr>
+                <w:p>
+                  <w:pPr>
+                    <w:pStyle w:val="Description"/>
+                    <w:spacing w:before="0" w:after="0"/>
+                    <w:jc w:val="left"/>
+                    <w:rPr>
+                      <w:rFonts w:ascii="Tahoma" w:hAnsi="Tahoma" w:cs="Tahoma"/>
+                      <w:color w:val="595959"/>
+                      <w:sz w:val="18"/>
+                      <w:szCs w:val="18"/>
+                      <w:lang w:eastAsia="ru-RU"/>
+                    </w:rPr>
+                  </w:pPr>
+                  <w:r>
+                    <w:rPr>
+                      <w:rFonts w:ascii="Tahoma" w:hAnsi="Tahoma" w:cs="Tahoma"/>
+                      <w:b/>
+                      <w:bCs/>
+                      <w:color w:val="595959"/>
+                      <w:sz w:val="18"/>
+                      <w:szCs w:val="18"/>
+                      <w:lang w:val="ru-RU" w:eastAsia="ru-RU"/>
+                    </w:rPr>
+                    <w:t>Годы обучения</w:t>
+                  </w:r>
+                  <w:r>
+                    <w:rPr>
+                      <w:rFonts w:ascii="Tahoma" w:hAnsi="Tahoma" w:cs="Tahoma"/>
+                      <w:b/>
+                      <w:bCs/>
+                      <w:color w:val="595959"/>
+                      <w:sz w:val="18"/>
+                      <w:szCs w:val="18"/>
+                      <w:lang w:eastAsia="ru-RU"/>
+                    </w:rPr>
+                    <w:t>:</w:t>
+                  </w:r>
+                </w:p>
+              </w:tc>
+              <w:tc>
+                <w:tcPr>
+                  <w:tcW w:w="7249" w:type="dxa"/>
                   <w:vAlign w:val="center"/>
                 </w:tcPr>
                 <w:p>
@@ -3211,21 +3471,39 @@
                       <w:rFonts w:ascii="Tahoma" w:hAnsi="Tahoma" w:cs="Tahoma"/>
                       <w:color w:val="595959"/>
                       <w:sz w:val="20"/>
+                      <w:lang w:val="en-US" w:eastAsia="ru-RU"/>
+                    </w:rPr>
+                    <w:t>03/</w:t>
+                  </w:r>
+                  <w:r>
+                    <w:rPr>
+                      <w:rFonts w:ascii="Tahoma" w:hAnsi="Tahoma" w:cs="Tahoma"/>
+                      <w:color w:val="595959"/>
+                      <w:sz w:val="20"/>
+                      <w:lang w:val="en-US" w:eastAsia="ru-RU"/>
+                    </w:rPr>
+                    <w:t>20</w:t>
+                  </w:r>
+                  <w:r>
+                    <w:rPr>
+                      <w:rFonts w:ascii="Tahoma" w:hAnsi="Tahoma" w:cs="Tahoma"/>
+                      <w:color w:val="595959"/>
+                      <w:sz w:val="20"/>
                       <w:lang w:val="ru-RU" w:eastAsia="ru-RU"/>
                     </w:rPr>
-                    <w:t xml:space="preserve">0723721, 0711999, 0711998, 0425657, 0422440, 0423974, 0729552, 0441358, 0721678, 0703649, 0720836, 0721985 </w:t>
+                    <w:t>20</w:t>
                   </w:r>
                 </w:p>
               </w:tc>
             </w:tr>
             <w:tr>
               <w:trPr>
-                <w:trHeight w:val="284"/>
+                <w:trHeight w:val="285"/>
                 <w:jc w:val="center"/>
               </w:trPr>
               <w:tc>
                 <w:tcPr>
-                  <w:tcW w:w="2958" w:type="dxa"/>
+                  <w:tcW w:w="2952" w:type="dxa"/>
                   <w:vAlign w:val="center"/>
                 </w:tcPr>
                 <w:p>
@@ -3272,18 +3550,19 @@
               </w:tc>
               <w:tc>
                 <w:tcPr>
-                  <w:tcW w:w="7248" w:type="dxa"/>
+                  <w:tcW w:w="7249" w:type="dxa"/>
                   <w:vAlign w:val="center"/>
                 </w:tcPr>
                 <w:p>
                   <w:pPr>
-                    <w:autoSpaceDE/>
-                    <w:autoSpaceDN/>
+                    <w:pStyle w:val="Description"/>
+                    <w:spacing w:before="0" w:after="0"/>
                     <w:jc w:val="left"/>
                     <w:rPr>
                       <w:rFonts w:ascii="Tahoma" w:hAnsi="Tahoma" w:cs="Tahoma"/>
+                      <w:color w:val="595959"/>
                       <w:sz w:val="20"/>
-                      <w:lang w:val="ru-RU"/>
+                      <w:lang w:val="ru-RU" w:eastAsia="ru-RU"/>
                     </w:rPr>
                   </w:pPr>
                   <w:hyperlink r:id="rId10" w:history="1">

</xml_diff>

<commit_message>
update resume, add cert 'Probation'
</commit_message>
<xml_diff>
--- a/Documents/dmitrii_konstantinov_cv.docx
+++ b/Documents/dmitrii_konstantinov_cv.docx
@@ -1226,6 +1226,20 @@
           <w:rFonts w:cs="Tahoma"/>
         </w:rPr>
         <w:t>SwiftLint</w:t>
+      </w:r>
+      <w:proofErr w:type="spellEnd"/>
+      <w:r>
+        <w:rPr>
+          <w:rFonts w:cs="Tahoma"/>
+        </w:rPr>
+        <w:t xml:space="preserve">, </w:t>
+      </w:r>
+      <w:proofErr w:type="spellStart"/>
+      <w:r>
+        <w:rPr>
+          <w:rFonts w:cs="Tahoma"/>
+        </w:rPr>
+        <w:t>MessageKit</w:t>
       </w:r>
       <w:proofErr w:type="spellEnd"/>
     </w:p>
@@ -1902,7 +1916,49 @@
                       <w:sz w:val="20"/>
                       <w:lang w:val="ru-RU"/>
                     </w:rPr>
-                    <w:t xml:space="preserve">, Английский для </w:t>
+                    <w:t xml:space="preserve">, </w:t>
+                  </w:r>
+                  <w:r>
+                    <w:rPr>
+                      <w:rStyle w:val="hps"/>
+                      <w:rFonts w:ascii="Tahoma" w:hAnsi="Tahoma" w:cs="Tahoma"/>
+                      <w:color w:val="595959"/>
+                      <w:sz w:val="20"/>
+                      <w:lang w:val="ru-RU"/>
+                    </w:rPr>
+                    <w:t xml:space="preserve">Стажировка в </w:t>
+                  </w:r>
+                  <w:proofErr w:type="spellStart"/>
+                  <w:r>
+                    <w:rPr>
+                      <w:rStyle w:val="hps"/>
+                      <w:rFonts w:ascii="Tahoma" w:hAnsi="Tahoma" w:cs="Tahoma"/>
+                      <w:color w:val="595959"/>
+                      <w:sz w:val="20"/>
+                      <w:lang w:val="en-US"/>
+                    </w:rPr>
+                    <w:t>GeekBrains</w:t>
+                  </w:r>
+                  <w:proofErr w:type="spellEnd"/>
+                  <w:r>
+                    <w:rPr>
+                      <w:rStyle w:val="hps"/>
+                      <w:rFonts w:ascii="Tahoma" w:hAnsi="Tahoma" w:cs="Tahoma"/>
+                      <w:color w:val="595959"/>
+                      <w:sz w:val="20"/>
+                      <w:lang w:val="ru-RU"/>
+                    </w:rPr>
+                    <w:t xml:space="preserve"> (0795444), </w:t>
+                  </w:r>
+                  <w:r>
+                    <w:rPr>
+                      <w:rStyle w:val="hps"/>
+                      <w:rFonts w:ascii="Tahoma" w:hAnsi="Tahoma" w:cs="Tahoma"/>
+                      <w:color w:val="595959"/>
+                      <w:sz w:val="20"/>
+                      <w:lang w:val="ru-RU"/>
+                    </w:rPr>
+                    <w:t xml:space="preserve">Английский для </w:t>
                   </w:r>
                   <w:r>
                     <w:rPr>

</xml_diff>